<commit_message>
Se agrego el .gitignore para eliminar archivos temporales y ademas se hizo modificación en la lista de cambios
</commit_message>
<xml_diff>
--- a/ENTREGAS/LIsta-de-cambios.docx
+++ b/ENTREGAS/LIsta-de-cambios.docx
@@ -21,11 +21,19 @@
             <w:tcW w:w="793" w:type="dxa"/>
           </w:tcPr>
           <w:p>
+            <w:pPr>
+              <w:jc w:val="center"/>
+              <w:rPr>
+                <w:b/>
+                <w:bCs/>
+              </w:rPr>
+            </w:pPr>
             <w:r>
+              <w:rPr>
+                <w:b/>
+                <w:bCs/>
+              </w:rPr>
               <w:t>Núm.</w:t>
-            </w:r>
-            <w:r>
-              <w:t xml:space="preserve"> </w:t>
             </w:r>
           </w:p>
         </w:tc>
@@ -34,8 +42,19 @@
             <w:tcW w:w="1470" w:type="dxa"/>
           </w:tcPr>
           <w:p>
+            <w:pPr>
+              <w:jc w:val="center"/>
+              <w:rPr>
+                <w:b/>
+                <w:bCs/>
+              </w:rPr>
+            </w:pPr>
             <w:r>
-              <w:t xml:space="preserve">Fecha </w:t>
+              <w:rPr>
+                <w:b/>
+                <w:bCs/>
+              </w:rPr>
+              <w:t>Fecha</w:t>
             </w:r>
           </w:p>
         </w:tc>
@@ -44,7 +63,18 @@
             <w:tcW w:w="4379" w:type="dxa"/>
           </w:tcPr>
           <w:p>
+            <w:pPr>
+              <w:jc w:val="center"/>
+              <w:rPr>
+                <w:b/>
+                <w:bCs/>
+              </w:rPr>
+            </w:pPr>
             <w:r>
+              <w:rPr>
+                <w:b/>
+                <w:bCs/>
+              </w:rPr>
               <w:t>Descripción</w:t>
             </w:r>
           </w:p>
@@ -54,7 +84,18 @@
             <w:tcW w:w="2186" w:type="dxa"/>
           </w:tcPr>
           <w:p>
+            <w:pPr>
+              <w:jc w:val="center"/>
+              <w:rPr>
+                <w:b/>
+                <w:bCs/>
+              </w:rPr>
+            </w:pPr>
             <w:r>
+              <w:rPr>
+                <w:b/>
+                <w:bCs/>
+              </w:rPr>
               <w:t>Autor/es</w:t>
             </w:r>
           </w:p>
@@ -75,19 +116,31 @@
           <w:tcPr>
             <w:tcW w:w="1470" w:type="dxa"/>
           </w:tcPr>
-          <w:p/>
+          <w:p>
+            <w:r>
+              <w:t>23/03/2026</w:t>
+            </w:r>
+          </w:p>
         </w:tc>
         <w:tc>
           <w:tcPr>
             <w:tcW w:w="4379" w:type="dxa"/>
           </w:tcPr>
-          <w:p/>
+          <w:p>
+            <w:r>
+              <w:t>Se añadió el documento Diseño del sistema a la rama de Actividades en la carpeta de /ENTREGAS y además se añadió a la carpeta de /EVIDENCIAS en formato .png el diagrama de despliegue</w:t>
+            </w:r>
+          </w:p>
         </w:tc>
         <w:tc>
           <w:tcPr>
             <w:tcW w:w="2186" w:type="dxa"/>
           </w:tcPr>
-          <w:p/>
+          <w:p>
+            <w:r>
+              <w:t>Duvan A.</w:t>
+            </w:r>
+          </w:p>
         </w:tc>
       </w:tr>
       <w:tr>
@@ -152,7 +205,7 @@
   <w:docDefaults>
     <w:rPrDefault>
       <w:rPr>
-        <w:rFonts w:asciiTheme="minorHAnsi" w:eastAsiaTheme="minorHAnsi" w:hAnsiTheme="minorHAnsi" w:cstheme="minorBidi"/>
+        <w:rFonts w:ascii="Times New Roman" w:eastAsiaTheme="minorHAnsi" w:hAnsi="Times New Roman" w:cs="Times New Roman"/>
         <w:kern w:val="2"/>
         <w:sz w:val="24"/>
         <w:szCs w:val="24"/>
@@ -162,7 +215,7 @@
     </w:rPrDefault>
     <w:pPrDefault>
       <w:pPr>
-        <w:spacing w:after="160" w:line="278" w:lineRule="auto"/>
+        <w:spacing w:line="480" w:lineRule="auto"/>
       </w:pPr>
     </w:pPrDefault>
   </w:docDefaults>
@@ -672,7 +725,7 @@
     <w:pPr>
       <w:keepNext/>
       <w:keepLines/>
-      <w:spacing w:before="40" w:after="0"/>
+      <w:spacing w:before="40"/>
       <w:outlineLvl w:val="5"/>
     </w:pPr>
     <w:rPr>
@@ -695,7 +748,7 @@
     <w:pPr>
       <w:keepNext/>
       <w:keepLines/>
-      <w:spacing w:before="40" w:after="0"/>
+      <w:spacing w:before="40"/>
       <w:outlineLvl w:val="6"/>
     </w:pPr>
     <w:rPr>
@@ -716,7 +769,6 @@
     <w:pPr>
       <w:keepNext/>
       <w:keepLines/>
-      <w:spacing w:after="0"/>
       <w:outlineLvl w:val="7"/>
     </w:pPr>
     <w:rPr>
@@ -739,7 +791,6 @@
     <w:pPr>
       <w:keepNext/>
       <w:keepLines/>
-      <w:spacing w:after="0"/>
       <w:outlineLvl w:val="8"/>
     </w:pPr>
     <w:rPr>
@@ -1070,7 +1121,7 @@
     <w:uiPriority w:val="39"/>
     <w:rsid w:val="00131CF7"/>
     <w:pPr>
-      <w:spacing w:after="0" w:line="240" w:lineRule="auto"/>
+      <w:spacing w:line="240" w:lineRule="auto"/>
     </w:pPr>
     <w:tblPr>
       <w:tblBorders>

</xml_diff>

<commit_message>
Se añadio el plan de pruebas
</commit_message>
<xml_diff>
--- a/ENTREGAS/LIsta-de-cambios.docx
+++ b/ENTREGAS/LIsta-de-cambios.docx
@@ -4,7 +4,7 @@
   <w:body>
     <w:tbl>
       <w:tblPr>
-        <w:tblStyle w:val="Tablaconcuadrcula"/>
+        <w:tblStyle w:val="TableGrid"/>
         <w:tblpPr w:leftFromText="141" w:rightFromText="141" w:vertAnchor="text" w:horzAnchor="margin" w:tblpY="918"/>
         <w:tblW w:w="0" w:type="auto"/>
         <w:tblLook w:val="04A0" w:firstRow="1" w:lastRow="0" w:firstColumn="1" w:lastColumn="0" w:noHBand="0" w:noVBand="1"/>
@@ -137,8 +137,13 @@
             <w:tcW w:w="2186" w:type="dxa"/>
           </w:tcPr>
           <w:p>
-            <w:r>
-              <w:t>Duvan A.</w:t>
+            <w:proofErr w:type="spellStart"/>
+            <w:r>
+              <w:t>Duvan</w:t>
+            </w:r>
+            <w:proofErr w:type="spellEnd"/>
+            <w:r>
+              <w:t xml:space="preserve"> A.</w:t>
             </w:r>
           </w:p>
         </w:tc>
@@ -193,6 +198,48 @@
           <w:p>
             <w:r>
               <w:t>Luis C.</w:t>
+            </w:r>
+          </w:p>
+        </w:tc>
+      </w:tr>
+      <w:tr>
+        <w:tc>
+          <w:tcPr>
+            <w:tcW w:w="793" w:type="dxa"/>
+          </w:tcPr>
+          <w:p>
+            <w:r>
+              <w:t>2</w:t>
+            </w:r>
+          </w:p>
+        </w:tc>
+        <w:tc>
+          <w:tcPr>
+            <w:tcW w:w="1470" w:type="dxa"/>
+          </w:tcPr>
+          <w:p>
+            <w:r>
+              <w:t>27/05/2026</w:t>
+            </w:r>
+          </w:p>
+        </w:tc>
+        <w:tc>
+          <w:tcPr>
+            <w:tcW w:w="4379" w:type="dxa"/>
+          </w:tcPr>
+          <w:p>
+            <w:r>
+              <w:t>Se añadió el documento que contiene los diferentes tipos de pruebas en la carpeta de /ENTREGAS</w:t>
+            </w:r>
+          </w:p>
+        </w:tc>
+        <w:tc>
+          <w:tcPr>
+            <w:tcW w:w="2186" w:type="dxa"/>
+          </w:tcPr>
+          <w:p>
+            <w:r>
+              <w:t>Salome A.</w:t>
             </w:r>
           </w:p>
         </w:tc>
@@ -629,11 +676,11 @@
     <w:name w:val="Normal"/>
     <w:qFormat/>
   </w:style>
-  <w:style w:type="paragraph" w:styleId="Ttulo1">
+  <w:style w:type="paragraph" w:styleId="Heading1">
     <w:name w:val="heading 1"/>
     <w:basedOn w:val="Normal"/>
     <w:next w:val="Normal"/>
-    <w:link w:val="Ttulo1Car"/>
+    <w:link w:val="Heading1Char"/>
     <w:uiPriority w:val="9"/>
     <w:qFormat/>
     <w:rsid w:val="00131CF7"/>
@@ -650,11 +697,11 @@
       <w:szCs w:val="40"/>
     </w:rPr>
   </w:style>
-  <w:style w:type="paragraph" w:styleId="Ttulo2">
+  <w:style w:type="paragraph" w:styleId="Heading2">
     <w:name w:val="heading 2"/>
     <w:basedOn w:val="Normal"/>
     <w:next w:val="Normal"/>
-    <w:link w:val="Ttulo2Car"/>
+    <w:link w:val="Heading2Char"/>
     <w:uiPriority w:val="9"/>
     <w:semiHidden/>
     <w:unhideWhenUsed/>
@@ -673,11 +720,11 @@
       <w:szCs w:val="32"/>
     </w:rPr>
   </w:style>
-  <w:style w:type="paragraph" w:styleId="Ttulo3">
+  <w:style w:type="paragraph" w:styleId="Heading3">
     <w:name w:val="heading 3"/>
     <w:basedOn w:val="Normal"/>
     <w:next w:val="Normal"/>
-    <w:link w:val="Ttulo3Car"/>
+    <w:link w:val="Heading3Char"/>
     <w:uiPriority w:val="9"/>
     <w:semiHidden/>
     <w:unhideWhenUsed/>
@@ -696,11 +743,11 @@
       <w:szCs w:val="28"/>
     </w:rPr>
   </w:style>
-  <w:style w:type="paragraph" w:styleId="Ttulo4">
+  <w:style w:type="paragraph" w:styleId="Heading4">
     <w:name w:val="heading 4"/>
     <w:basedOn w:val="Normal"/>
     <w:next w:val="Normal"/>
-    <w:link w:val="Ttulo4Car"/>
+    <w:link w:val="Heading4Char"/>
     <w:uiPriority w:val="9"/>
     <w:semiHidden/>
     <w:unhideWhenUsed/>
@@ -719,11 +766,11 @@
       <w:color w:val="0F4761" w:themeColor="accent1" w:themeShade="BF"/>
     </w:rPr>
   </w:style>
-  <w:style w:type="paragraph" w:styleId="Ttulo5">
+  <w:style w:type="paragraph" w:styleId="Heading5">
     <w:name w:val="heading 5"/>
     <w:basedOn w:val="Normal"/>
     <w:next w:val="Normal"/>
-    <w:link w:val="Ttulo5Car"/>
+    <w:link w:val="Heading5Char"/>
     <w:uiPriority w:val="9"/>
     <w:semiHidden/>
     <w:unhideWhenUsed/>
@@ -740,11 +787,11 @@
       <w:color w:val="0F4761" w:themeColor="accent1" w:themeShade="BF"/>
     </w:rPr>
   </w:style>
-  <w:style w:type="paragraph" w:styleId="Ttulo6">
+  <w:style w:type="paragraph" w:styleId="Heading6">
     <w:name w:val="heading 6"/>
     <w:basedOn w:val="Normal"/>
     <w:next w:val="Normal"/>
-    <w:link w:val="Ttulo6Car"/>
+    <w:link w:val="Heading6Char"/>
     <w:uiPriority w:val="9"/>
     <w:semiHidden/>
     <w:unhideWhenUsed/>
@@ -763,11 +810,11 @@
       <w:color w:val="595959" w:themeColor="text1" w:themeTint="A6"/>
     </w:rPr>
   </w:style>
-  <w:style w:type="paragraph" w:styleId="Ttulo7">
+  <w:style w:type="paragraph" w:styleId="Heading7">
     <w:name w:val="heading 7"/>
     <w:basedOn w:val="Normal"/>
     <w:next w:val="Normal"/>
-    <w:link w:val="Ttulo7Car"/>
+    <w:link w:val="Heading7Char"/>
     <w:uiPriority w:val="9"/>
     <w:semiHidden/>
     <w:unhideWhenUsed/>
@@ -784,11 +831,11 @@
       <w:color w:val="595959" w:themeColor="text1" w:themeTint="A6"/>
     </w:rPr>
   </w:style>
-  <w:style w:type="paragraph" w:styleId="Ttulo8">
+  <w:style w:type="paragraph" w:styleId="Heading8">
     <w:name w:val="heading 8"/>
     <w:basedOn w:val="Normal"/>
     <w:next w:val="Normal"/>
-    <w:link w:val="Ttulo8Car"/>
+    <w:link w:val="Heading8Char"/>
     <w:uiPriority w:val="9"/>
     <w:semiHidden/>
     <w:unhideWhenUsed/>
@@ -806,11 +853,11 @@
       <w:color w:val="272727" w:themeColor="text1" w:themeTint="D8"/>
     </w:rPr>
   </w:style>
-  <w:style w:type="paragraph" w:styleId="Ttulo9">
+  <w:style w:type="paragraph" w:styleId="Heading9">
     <w:name w:val="heading 9"/>
     <w:basedOn w:val="Normal"/>
     <w:next w:val="Normal"/>
-    <w:link w:val="Ttulo9Car"/>
+    <w:link w:val="Heading9Char"/>
     <w:uiPriority w:val="9"/>
     <w:semiHidden/>
     <w:unhideWhenUsed/>
@@ -826,13 +873,13 @@
       <w:color w:val="272727" w:themeColor="text1" w:themeTint="D8"/>
     </w:rPr>
   </w:style>
-  <w:style w:type="character" w:default="1" w:styleId="Fuentedeprrafopredeter">
+  <w:style w:type="character" w:default="1" w:styleId="DefaultParagraphFont">
     <w:name w:val="Default Paragraph Font"/>
     <w:uiPriority w:val="1"/>
     <w:semiHidden/>
     <w:unhideWhenUsed/>
   </w:style>
-  <w:style w:type="table" w:default="1" w:styleId="Tablanormal">
+  <w:style w:type="table" w:default="1" w:styleId="TableNormal">
     <w:name w:val="Normal Table"/>
     <w:uiPriority w:val="99"/>
     <w:semiHidden/>
@@ -847,16 +894,16 @@
       </w:tblCellMar>
     </w:tblPr>
   </w:style>
-  <w:style w:type="numbering" w:default="1" w:styleId="Sinlista">
+  <w:style w:type="numbering" w:default="1" w:styleId="NoList">
     <w:name w:val="No List"/>
     <w:uiPriority w:val="99"/>
     <w:semiHidden/>
     <w:unhideWhenUsed/>
   </w:style>
-  <w:style w:type="character" w:customStyle="1" w:styleId="Ttulo1Car">
-    <w:name w:val="Título 1 Car"/>
-    <w:basedOn w:val="Fuentedeprrafopredeter"/>
-    <w:link w:val="Ttulo1"/>
+  <w:style w:type="character" w:customStyle="1" w:styleId="Heading1Char">
+    <w:name w:val="Heading 1 Char"/>
+    <w:basedOn w:val="DefaultParagraphFont"/>
+    <w:link w:val="Heading1"/>
     <w:uiPriority w:val="9"/>
     <w:rsid w:val="00131CF7"/>
     <w:rPr>
@@ -866,10 +913,10 @@
       <w:szCs w:val="40"/>
     </w:rPr>
   </w:style>
-  <w:style w:type="character" w:customStyle="1" w:styleId="Ttulo2Car">
-    <w:name w:val="Título 2 Car"/>
-    <w:basedOn w:val="Fuentedeprrafopredeter"/>
-    <w:link w:val="Ttulo2"/>
+  <w:style w:type="character" w:customStyle="1" w:styleId="Heading2Char">
+    <w:name w:val="Heading 2 Char"/>
+    <w:basedOn w:val="DefaultParagraphFont"/>
+    <w:link w:val="Heading2"/>
     <w:uiPriority w:val="9"/>
     <w:semiHidden/>
     <w:rsid w:val="00131CF7"/>
@@ -880,10 +927,10 @@
       <w:szCs w:val="32"/>
     </w:rPr>
   </w:style>
-  <w:style w:type="character" w:customStyle="1" w:styleId="Ttulo3Car">
-    <w:name w:val="Título 3 Car"/>
-    <w:basedOn w:val="Fuentedeprrafopredeter"/>
-    <w:link w:val="Ttulo3"/>
+  <w:style w:type="character" w:customStyle="1" w:styleId="Heading3Char">
+    <w:name w:val="Heading 3 Char"/>
+    <w:basedOn w:val="DefaultParagraphFont"/>
+    <w:link w:val="Heading3"/>
     <w:uiPriority w:val="9"/>
     <w:semiHidden/>
     <w:rsid w:val="00131CF7"/>
@@ -894,10 +941,10 @@
       <w:szCs w:val="28"/>
     </w:rPr>
   </w:style>
-  <w:style w:type="character" w:customStyle="1" w:styleId="Ttulo4Car">
-    <w:name w:val="Título 4 Car"/>
-    <w:basedOn w:val="Fuentedeprrafopredeter"/>
-    <w:link w:val="Ttulo4"/>
+  <w:style w:type="character" w:customStyle="1" w:styleId="Heading4Char">
+    <w:name w:val="Heading 4 Char"/>
+    <w:basedOn w:val="DefaultParagraphFont"/>
+    <w:link w:val="Heading4"/>
     <w:uiPriority w:val="9"/>
     <w:semiHidden/>
     <w:rsid w:val="00131CF7"/>
@@ -908,10 +955,10 @@
       <w:color w:val="0F4761" w:themeColor="accent1" w:themeShade="BF"/>
     </w:rPr>
   </w:style>
-  <w:style w:type="character" w:customStyle="1" w:styleId="Ttulo5Car">
-    <w:name w:val="Título 5 Car"/>
-    <w:basedOn w:val="Fuentedeprrafopredeter"/>
-    <w:link w:val="Ttulo5"/>
+  <w:style w:type="character" w:customStyle="1" w:styleId="Heading5Char">
+    <w:name w:val="Heading 5 Char"/>
+    <w:basedOn w:val="DefaultParagraphFont"/>
+    <w:link w:val="Heading5"/>
     <w:uiPriority w:val="9"/>
     <w:semiHidden/>
     <w:rsid w:val="00131CF7"/>
@@ -920,10 +967,10 @@
       <w:color w:val="0F4761" w:themeColor="accent1" w:themeShade="BF"/>
     </w:rPr>
   </w:style>
-  <w:style w:type="character" w:customStyle="1" w:styleId="Ttulo6Car">
-    <w:name w:val="Título 6 Car"/>
-    <w:basedOn w:val="Fuentedeprrafopredeter"/>
-    <w:link w:val="Ttulo6"/>
+  <w:style w:type="character" w:customStyle="1" w:styleId="Heading6Char">
+    <w:name w:val="Heading 6 Char"/>
+    <w:basedOn w:val="DefaultParagraphFont"/>
+    <w:link w:val="Heading6"/>
     <w:uiPriority w:val="9"/>
     <w:semiHidden/>
     <w:rsid w:val="00131CF7"/>
@@ -934,10 +981,10 @@
       <w:color w:val="595959" w:themeColor="text1" w:themeTint="A6"/>
     </w:rPr>
   </w:style>
-  <w:style w:type="character" w:customStyle="1" w:styleId="Ttulo7Car">
-    <w:name w:val="Título 7 Car"/>
-    <w:basedOn w:val="Fuentedeprrafopredeter"/>
-    <w:link w:val="Ttulo7"/>
+  <w:style w:type="character" w:customStyle="1" w:styleId="Heading7Char">
+    <w:name w:val="Heading 7 Char"/>
+    <w:basedOn w:val="DefaultParagraphFont"/>
+    <w:link w:val="Heading7"/>
     <w:uiPriority w:val="9"/>
     <w:semiHidden/>
     <w:rsid w:val="00131CF7"/>
@@ -946,10 +993,10 @@
       <w:color w:val="595959" w:themeColor="text1" w:themeTint="A6"/>
     </w:rPr>
   </w:style>
-  <w:style w:type="character" w:customStyle="1" w:styleId="Ttulo8Car">
-    <w:name w:val="Título 8 Car"/>
-    <w:basedOn w:val="Fuentedeprrafopredeter"/>
-    <w:link w:val="Ttulo8"/>
+  <w:style w:type="character" w:customStyle="1" w:styleId="Heading8Char">
+    <w:name w:val="Heading 8 Char"/>
+    <w:basedOn w:val="DefaultParagraphFont"/>
+    <w:link w:val="Heading8"/>
     <w:uiPriority w:val="9"/>
     <w:semiHidden/>
     <w:rsid w:val="00131CF7"/>
@@ -960,10 +1007,10 @@
       <w:color w:val="272727" w:themeColor="text1" w:themeTint="D8"/>
     </w:rPr>
   </w:style>
-  <w:style w:type="character" w:customStyle="1" w:styleId="Ttulo9Car">
-    <w:name w:val="Título 9 Car"/>
-    <w:basedOn w:val="Fuentedeprrafopredeter"/>
-    <w:link w:val="Ttulo9"/>
+  <w:style w:type="character" w:customStyle="1" w:styleId="Heading9Char">
+    <w:name w:val="Heading 9 Char"/>
+    <w:basedOn w:val="DefaultParagraphFont"/>
+    <w:link w:val="Heading9"/>
     <w:uiPriority w:val="9"/>
     <w:semiHidden/>
     <w:rsid w:val="00131CF7"/>
@@ -972,11 +1019,11 @@
       <w:color w:val="272727" w:themeColor="text1" w:themeTint="D8"/>
     </w:rPr>
   </w:style>
-  <w:style w:type="paragraph" w:styleId="Ttulo">
+  <w:style w:type="paragraph" w:styleId="Title">
     <w:name w:val="Title"/>
     <w:basedOn w:val="Normal"/>
     <w:next w:val="Normal"/>
-    <w:link w:val="TtuloCar"/>
+    <w:link w:val="TitleChar"/>
     <w:uiPriority w:val="10"/>
     <w:qFormat/>
     <w:rsid w:val="00131CF7"/>
@@ -992,10 +1039,10 @@
       <w:szCs w:val="56"/>
     </w:rPr>
   </w:style>
-  <w:style w:type="character" w:customStyle="1" w:styleId="TtuloCar">
-    <w:name w:val="Título Car"/>
-    <w:basedOn w:val="Fuentedeprrafopredeter"/>
-    <w:link w:val="Ttulo"/>
+  <w:style w:type="character" w:customStyle="1" w:styleId="TitleChar">
+    <w:name w:val="Title Char"/>
+    <w:basedOn w:val="DefaultParagraphFont"/>
+    <w:link w:val="Title"/>
     <w:uiPriority w:val="10"/>
     <w:rsid w:val="00131CF7"/>
     <w:rPr>
@@ -1006,11 +1053,11 @@
       <w:szCs w:val="56"/>
     </w:rPr>
   </w:style>
-  <w:style w:type="paragraph" w:styleId="Subttulo">
+  <w:style w:type="paragraph" w:styleId="Subtitle">
     <w:name w:val="Subtitle"/>
     <w:basedOn w:val="Normal"/>
     <w:next w:val="Normal"/>
-    <w:link w:val="SubttuloCar"/>
+    <w:link w:val="SubtitleChar"/>
     <w:uiPriority w:val="11"/>
     <w:qFormat/>
     <w:rsid w:val="00131CF7"/>
@@ -1027,10 +1074,10 @@
       <w:szCs w:val="28"/>
     </w:rPr>
   </w:style>
-  <w:style w:type="character" w:customStyle="1" w:styleId="SubttuloCar">
-    <w:name w:val="Subtítulo Car"/>
-    <w:basedOn w:val="Fuentedeprrafopredeter"/>
-    <w:link w:val="Subttulo"/>
+  <w:style w:type="character" w:customStyle="1" w:styleId="SubtitleChar">
+    <w:name w:val="Subtitle Char"/>
+    <w:basedOn w:val="DefaultParagraphFont"/>
+    <w:link w:val="Subtitle"/>
     <w:uiPriority w:val="11"/>
     <w:rsid w:val="00131CF7"/>
     <w:rPr>
@@ -1041,11 +1088,11 @@
       <w:szCs w:val="28"/>
     </w:rPr>
   </w:style>
-  <w:style w:type="paragraph" w:styleId="Cita">
+  <w:style w:type="paragraph" w:styleId="Quote">
     <w:name w:val="Quote"/>
     <w:basedOn w:val="Normal"/>
     <w:next w:val="Normal"/>
-    <w:link w:val="CitaCar"/>
+    <w:link w:val="QuoteChar"/>
     <w:uiPriority w:val="29"/>
     <w:qFormat/>
     <w:rsid w:val="00131CF7"/>
@@ -1059,10 +1106,10 @@
       <w:color w:val="404040" w:themeColor="text1" w:themeTint="BF"/>
     </w:rPr>
   </w:style>
-  <w:style w:type="character" w:customStyle="1" w:styleId="CitaCar">
-    <w:name w:val="Cita Car"/>
-    <w:basedOn w:val="Fuentedeprrafopredeter"/>
-    <w:link w:val="Cita"/>
+  <w:style w:type="character" w:customStyle="1" w:styleId="QuoteChar">
+    <w:name w:val="Quote Char"/>
+    <w:basedOn w:val="DefaultParagraphFont"/>
+    <w:link w:val="Quote"/>
     <w:uiPriority w:val="29"/>
     <w:rsid w:val="00131CF7"/>
     <w:rPr>
@@ -1071,7 +1118,7 @@
       <w:color w:val="404040" w:themeColor="text1" w:themeTint="BF"/>
     </w:rPr>
   </w:style>
-  <w:style w:type="paragraph" w:styleId="Prrafodelista">
+  <w:style w:type="paragraph" w:styleId="ListParagraph">
     <w:name w:val="List Paragraph"/>
     <w:basedOn w:val="Normal"/>
     <w:uiPriority w:val="34"/>
@@ -1082,9 +1129,9 @@
       <w:contextualSpacing/>
     </w:pPr>
   </w:style>
-  <w:style w:type="character" w:styleId="nfasisintenso">
+  <w:style w:type="character" w:styleId="IntenseEmphasis">
     <w:name w:val="Intense Emphasis"/>
-    <w:basedOn w:val="Fuentedeprrafopredeter"/>
+    <w:basedOn w:val="DefaultParagraphFont"/>
     <w:uiPriority w:val="21"/>
     <w:qFormat/>
     <w:rsid w:val="00131CF7"/>
@@ -1094,11 +1141,11 @@
       <w:color w:val="0F4761" w:themeColor="accent1" w:themeShade="BF"/>
     </w:rPr>
   </w:style>
-  <w:style w:type="paragraph" w:styleId="Citadestacada">
+  <w:style w:type="paragraph" w:styleId="IntenseQuote">
     <w:name w:val="Intense Quote"/>
     <w:basedOn w:val="Normal"/>
     <w:next w:val="Normal"/>
-    <w:link w:val="CitadestacadaCar"/>
+    <w:link w:val="IntenseQuoteChar"/>
     <w:uiPriority w:val="30"/>
     <w:qFormat/>
     <w:rsid w:val="00131CF7"/>
@@ -1117,10 +1164,10 @@
       <w:color w:val="0F4761" w:themeColor="accent1" w:themeShade="BF"/>
     </w:rPr>
   </w:style>
-  <w:style w:type="character" w:customStyle="1" w:styleId="CitadestacadaCar">
-    <w:name w:val="Cita destacada Car"/>
-    <w:basedOn w:val="Fuentedeprrafopredeter"/>
-    <w:link w:val="Citadestacada"/>
+  <w:style w:type="character" w:customStyle="1" w:styleId="IntenseQuoteChar">
+    <w:name w:val="Intense Quote Char"/>
+    <w:basedOn w:val="DefaultParagraphFont"/>
+    <w:link w:val="IntenseQuote"/>
     <w:uiPriority w:val="30"/>
     <w:rsid w:val="00131CF7"/>
     <w:rPr>
@@ -1129,9 +1176,9 @@
       <w:color w:val="0F4761" w:themeColor="accent1" w:themeShade="BF"/>
     </w:rPr>
   </w:style>
-  <w:style w:type="character" w:styleId="Referenciaintensa">
+  <w:style w:type="character" w:styleId="IntenseReference">
     <w:name w:val="Intense Reference"/>
-    <w:basedOn w:val="Fuentedeprrafopredeter"/>
+    <w:basedOn w:val="DefaultParagraphFont"/>
     <w:uiPriority w:val="32"/>
     <w:qFormat/>
     <w:rsid w:val="00131CF7"/>
@@ -1143,9 +1190,9 @@
       <w:spacing w:val="5"/>
     </w:rPr>
   </w:style>
-  <w:style w:type="table" w:styleId="Tablaconcuadrcula">
+  <w:style w:type="table" w:styleId="TableGrid">
     <w:name w:val="Table Grid"/>
-    <w:basedOn w:val="Tablanormal"/>
+    <w:basedOn w:val="TableNormal"/>
     <w:uiPriority w:val="39"/>
     <w:rsid w:val="00131CF7"/>
     <w:pPr>

</xml_diff>